<commit_message>
docs: cap nhat huong dan su dung ban thuong mai chuan dep
</commit_message>
<xml_diff>
--- a/HUONG_DAN_SU_DUNG.docx
+++ b/HUONG_DAN_SU_DUNG.docx
@@ -4,34 +4,34 @@
   <w:body>
     <w:p>
       <w:pPr>
-        <w:spacing w:after="40"/>
+        <w:spacing w:before="120" w:after="40"/>
         <w:jc w:val="center"/>
       </w:pPr>
       <w:r>
         <w:rPr>
-          <w:rFonts w:ascii="Calibri" w:hAnsi="Calibri"/>
+          <w:rFonts w:ascii="Segoe UI" w:hAnsi="Segoe UI"/>
           <w:b/>
-          <w:color w:val="1F4E79"/>
+          <w:color w:val="1B365D"/>
           <w:sz w:val="44"/>
         </w:rPr>
-        <w:t>👑 FACEBOOK TRAFFIC MASTER PRO</w:t>
+        <w:t>🚀 FACEBOOK TRAFFIC MASTER</w:t>
       </w:r>
     </w:p>
     <w:p>
       <w:pPr>
-        <w:spacing w:after="280"/>
+        <w:spacing w:after="240"/>
         <w:jc w:val="center"/>
       </w:pPr>
       <w:r>
         <w:rPr>
-          <w:rFonts w:ascii="Calibri" w:hAnsi="Calibri"/>
-          <w:i/>
-          <w:color w:val="595959"/>
-          <w:sz w:val="22"/>
+          <w:rFonts w:ascii="Segoe UI" w:hAnsi="Segoe UI"/>
+          <w:b/>
+          <w:color w:val="64748B"/>
+          <w:sz w:val="21"/>
         </w:rPr>
-        <w:t>CẨM NANG HƯỚNG DẪN SỬ DỤNG TỪ A - Z DÀNH CHO NGƯỜI MỚI BẮT ĐẦU</w:t>
+        <w:t>HƯỚNG DẪN VẬN HÀNH BẢN THƯƠNG MẠI — DỄ HIỂU NHẤT TỪ A ĐẾN Z</w:t>
         <w:br/>
-        <w:t>(Ngắn Gọn · Dễ Hiểu · Xem Là Làm Được Ngay)</w:t>
+        <w:t>(Chuyên sâu: Chạy Full Tự Động · Tab 2 · Tab 3 · Tab 4 · Tab 5 · Xuất Excel Master)</w:t>
       </w:r>
     </w:p>
     <w:tbl>
@@ -47,27 +47,30 @@
         <w:tc>
           <w:tcPr>
             <w:tcW w:type="dxa" w:w="9792"/>
-            <w:shd w:fill="F2F4F7"/>
+            <w:shd w:fill="F0F4F8"/>
           </w:tcPr>
           <w:p>
             <w:pPr>
               <w:spacing w:before="120" w:after="120"/>
+              <w:ind w:left="144" w:right="144"/>
             </w:pPr>
             <w:r>
               <w:rPr>
-                <w:rFonts w:ascii="Calibri" w:hAnsi="Calibri"/>
-                <w:color w:val="263859"/>
+                <w:rFonts w:ascii="Segoe UI" w:hAnsi="Segoe UI"/>
+                <w:color w:val="1E293B"/>
                 <w:sz w:val="20"/>
               </w:rPr>
-              <w:t>💡 NGUYÊN LÝ HOẠT ĐỘNG CỰC KỲ ĐƠN GIẢN:</w:t>
+              <w:t>💡 QUY TRÌNH KÉO TRAFFIC 5 BƯỚC HOÀN TOÀN TỰ ĐỘNG:</w:t>
               <w:br/>
-              <w:t>Tool giúp bạn tự động 100% quy trình kéo Traffic Facebook về Website báo:</w:t>
+              <w:t>1. Cào bài viral từ nguồn chuẩn Facebook (Tab 1/Full Auto)</w:t>
               <w:br/>
-              <w:t>1. Cào bài viết viral từ các Fanpage lớn -&gt; 2. AI viết lại caption &amp; bài báo chuẩn SEO -&gt;</w:t>
+              <w:t>2. Quản lý &amp; lọc bài trong kho (Tab 2)</w:t>
               <w:br/>
-              <w:t>3. Tự tạo ảnh chống quét &amp; dựng Video Reel -&gt; 4. Đăng web báo tự động -&gt;</w:t>
+              <w:t>3. AI viết lại Caption &amp; Bài báo vệ tinh chuẩn SEO (Tab 3)</w:t>
               <w:br/>
-              <w:t>5. Xuất file Master Excel nạp thẳng vào GPM Login để tự động đăng lên Facebook!</w:t>
+              <w:t>4. Tự đăng website lấy link điều hướng + Tạo video Reel 10s có nhạc (Tab 4)</w:t>
+              <w:br/>
+              <w:t>5. Kiểm tra danh sách hoàn thành (Tab 5) -&gt; Xuất file Excel Master sạch đẹp để đăng bài!</w:t>
             </w:r>
           </w:p>
         </w:tc>
@@ -75,60 +78,29 @@
     </w:tbl>
     <w:p>
       <w:pPr>
-        <w:spacing w:before="280" w:after="120"/>
+        <w:spacing w:after="40"/>
+      </w:pPr>
+    </w:p>
+    <w:p>
+      <w:pPr>
+        <w:spacing w:before="320" w:after="120"/>
       </w:pPr>
       <w:r>
         <w:rPr>
-          <w:rFonts w:ascii="Calibri" w:hAnsi="Calibri"/>
+          <w:rFonts w:ascii="Segoe UI" w:hAnsi="Segoe UI"/>
           <w:b/>
-          <w:color w:val="1F4E79"/>
-          <w:sz w:val="30"/>
+          <w:color w:val="1B365D"/>
+          <w:sz w:val="28"/>
         </w:rPr>
-        <w:t>BƯỚC 1: GIẢI NÉN &amp; KHỞI ĐỘNG TOOL (MẤT 1 PHÚT)</w:t>
+        <w:t>1. CHỨC NĂNG CHẠY FULL TỰ ĐỘNG (1-CLICK TỪ A ĐẾN Z)</w:t>
       </w:r>
     </w:p>
     <w:p>
       <w:r>
         <w:rPr>
-          <w:b/>
+          <w:rFonts w:ascii="Segoe UI" w:hAnsi="Segoe UI"/>
         </w:rPr>
-        <w:t>1. Giải nén đúng cách:</w:t>
-        <w:br/>
-      </w:r>
-      <w:r>
-        <w:rPr>
-          <w:color w:val="000000"/>
-        </w:rPr>
-        <w:t xml:space="preserve">   • Tải file </w:t>
-      </w:r>
-      <w:r>
-        <w:rPr>
-          <w:b/>
-        </w:rPr>
-        <w:t>Facebook_Traffic_Master_Portable.zip</w:t>
-      </w:r>
-      <w:r>
-        <w:t xml:space="preserve"> về máy.</w:t>
-        <w:br/>
-        <w:t xml:space="preserve">   • Chuột phải vào file zip -&gt; Chọn </w:t>
-      </w:r>
-      <w:r>
-        <w:rPr>
-          <w:b/>
-        </w:rPr>
-        <w:t>Extract to Facebook_Traffic_Master</w:t>
-      </w:r>
-      <w:r>
-        <w:t xml:space="preserve"> bằng phần mềm </w:t>
-      </w:r>
-      <w:r>
-        <w:rPr>
-          <w:b/>
-        </w:rPr>
-        <w:t>WinRAR</w:t>
-      </w:r>
-      <w:r>
-        <w:t xml:space="preserve"> hoặc 7-Zip (giải nén bằng WinRAR siêu nhanh và không bị Windows chặn nhầm).</w:t>
+        <w:t>Đây là tính năng mạnh mẽ và tiện lợi nhất của phần mềm. Chỉ với đúng 1 nút bấm, tool sẽ tự động làm hết mọi việc từ cào bài, viết nội dung, đăng web cho đến dựng video Reel hoàn chỉnh.</w:t>
         <w:br/>
         <w:br/>
       </w:r>
@@ -136,60 +108,15 @@
         <w:rPr>
           <w:b/>
         </w:rPr>
-        <w:t>2. Mở phần mềm (Chỉ cần 1-Click):</w:t>
+        <w:t>• Bước 1: Chọn Vùng dữ liệu (US hoặc GLOBAL)</w:t>
         <w:br/>
       </w:r>
       <w:r>
-        <w:t xml:space="preserve">   • Mở thư mục vừa giải nén, nhấp đúp chuột vào file: </w:t>
-      </w:r>
-      <w:r>
-        <w:rPr>
-          <w:b/>
-          <w:color w:val="C00000"/>
-        </w:rPr>
-        <w:t>Facebook Traffic Master.lnk</w:t>
-      </w:r>
-      <w:r>
-        <w:t xml:space="preserve"> (hoặc file </w:t>
-      </w:r>
-      <w:r>
-        <w:rPr>
-          <w:b/>
-        </w:rPr>
-        <w:t>FacebookTrafficMaster.exe</w:t>
-      </w:r>
-      <w:r>
-        <w:t xml:space="preserve"> / </w:t>
-      </w:r>
-      <w:r>
-        <w:rPr>
-          <w:b/>
-        </w:rPr>
-        <w:t>FacebookTrafficMaster.vbs</w:t>
-      </w:r>
-      <w:r>
-        <w:t>).</w:t>
+        <w:t xml:space="preserve">   - Nhìn lên góc trên bên phải màn hình: Bấm chọn vùng bạn muốn làm:</w:t>
         <w:br/>
-        <w:t xml:space="preserve">   • Trình duyệt sẽ tự động bung ra giao diện Web tại địa chỉ: </w:t>
-      </w:r>
-      <w:r>
-        <w:rPr>
-          <w:b/>
-        </w:rPr>
-        <w:t>http://127.0.0.1:5001</w:t>
+        <w:t xml:space="preserve">     + 🇺🇸 US: Dành cho thị trường Mỹ (NFL, WNBA, Vụ án, Chính trị, Người nổi tiếng... -&gt; Đăng web PrimeVista24).</w:t>
         <w:br/>
-      </w:r>
-      <w:r>
-        <w:t xml:space="preserve">   • ⚠️ </w:t>
-      </w:r>
-      <w:r>
-        <w:rPr>
-          <w:b/>
-        </w:rPr>
-        <w:t xml:space="preserve">Lưu ý quan trọng: </w:t>
-      </w:r>
-      <w:r>
-        <w:t>Giữ cửa sổ đen (terminal) luôn chạy ngầm dưới thanh Taskbar trong lúc làm việc, không bấm tắt.</w:t>
+        <w:t xml:space="preserve">     + 🌍 GLOBAL: Dành cho thị trường Bắc Âu / Châu Âu (Hà Lan, Thụy Điển, Na Uy, Đan Mạch... -&gt; Đăng web DailyReveal).</w:t>
         <w:br/>
         <w:br/>
       </w:r>
@@ -197,250 +124,33 @@
         <w:rPr>
           <w:b/>
         </w:rPr>
-        <w:t>3. Kích hoạt bản quyền (Chỉ làm 1 lần duy nhất trên máy):</w:t>
+        <w:t>• Bước 2: Bấm nút "🚀 CHẠY FULL TỰ ĐỘNG"</w:t>
         <w:br/>
       </w:r>
       <w:r>
-        <w:t xml:space="preserve">   • Khi mở tool lần đầu, màn hình xanh bắt buộc kích hoạt bản quyền sẽ hiện lên:</w:t>
-        <w:br/>
-        <w:t xml:space="preserve">     - </w:t>
+        <w:t xml:space="preserve">   - Tại màn hình chính (Tab 1), bạn chỉ cần nhấp vào nút màu đỏ: </w:t>
       </w:r>
       <w:r>
         <w:rPr>
           <w:b/>
         </w:rPr>
-        <w:t xml:space="preserve">Ô LICENSE KEY: </w:t>
+        <w:t>🚀 CHẠY FULL TỰ ĐỘNG (CÀO + VIẾT + ĐĂNG WEB)</w:t>
       </w:r>
       <w:r>
-        <w:t xml:space="preserve">Dán mã bản quyền bạn nhận được từ Admin (ví dụ: </w:t>
+        <w:t>.</w:t>
+        <w:br/>
+        <w:t xml:space="preserve">   - Hộp thoại xác nhận sẽ hiện lên: Hệ thống cho phép bạn </w:t>
       </w:r>
       <w:r>
         <w:rPr>
           <w:b/>
         </w:rPr>
-        <w:t>FTM-XXXX-XXXX-XXXX</w:t>
+        <w:t>kiểm tra và chỉnh sửa nhanh danh sách chủ đề</w:t>
       </w:r>
       <w:r>
-        <w:t>).</w:t>
+        <w:t xml:space="preserve"> trước khi chạy (chống nhầm chủ đề).</w:t>
         <w:br/>
-        <w:t xml:space="preserve">     - </w:t>
-      </w:r>
-      <w:r>
-        <w:rPr>
-          <w:b/>
-        </w:rPr>
-        <w:t xml:space="preserve">Ô MÃ NHẬN DIỆN (TITLE PREFIX): </w:t>
-      </w:r>
-      <w:r>
-        <w:t xml:space="preserve">Nhập ký hiệu nhận diện của bạn (ví dụ: </w:t>
-      </w:r>
-      <w:r>
-        <w:rPr>
-          <w:b/>
-        </w:rPr>
-        <w:t>TH, NV01, HONG_DUC...</w:t>
-      </w:r>
-      <w:r>
-        <w:t>).</w:t>
-        <w:br/>
-        <w:t xml:space="preserve">       -&gt; </w:t>
-      </w:r>
-      <w:r>
-        <w:rPr>
-          <w:i/>
-        </w:rPr>
-        <w:t xml:space="preserve">Tác dụng: </w:t>
-      </w:r>
-      <w:r>
-        <w:t xml:space="preserve">Mã này sẽ tự động gắn vào đầu tiêu đề mọi bài báo khi đăng web (VD: </w:t>
-      </w:r>
-      <w:r>
-        <w:rPr>
-          <w:i/>
-        </w:rPr>
-        <w:t>TH - Messi lập hat-trick lịch sử...</w:t>
-      </w:r>
-      <w:r>
-        <w:t>) để nhận diện bài của ai, chống cào/đăng trùng với nhân viên khác!</w:t>
-        <w:br/>
-        <w:t xml:space="preserve">   • Bấm nút </w:t>
-      </w:r>
-      <w:r>
-        <w:rPr>
-          <w:b/>
-        </w:rPr>
-        <w:t>🚀 KÍCH HOẠT BẢN QUYỀN</w:t>
-      </w:r>
-      <w:r>
-        <w:t xml:space="preserve"> -&gt; Tool sẽ mở full tính năng vĩnh viễn trên máy của bạn!</w:t>
-      </w:r>
-    </w:p>
-    <w:p>
-      <w:pPr>
-        <w:spacing w:before="280" w:after="120"/>
-      </w:pPr>
-      <w:r>
-        <w:rPr>
-          <w:rFonts w:ascii="Calibri" w:hAnsi="Calibri"/>
-          <w:b/>
-          <w:color w:val="1F4E79"/>
-          <w:sz w:val="30"/>
-        </w:rPr>
-        <w:t>BƯỚC 2: CẤU HÌNH NHANH BAN ĐẦU (TAB 6 - CÀI ĐẶT)</w:t>
-      </w:r>
-    </w:p>
-    <w:p>
-      <w:r>
-        <w:t>Trước khi bắt đầu cào bài, bạn chỉ cần kiểm tra 3 mục cực kỳ đơn giản sau:</w:t>
-        <w:br/>
-      </w:r>
-      <w:r>
-        <w:rPr>
-          <w:b/>
-        </w:rPr>
-        <w:t xml:space="preserve">1. Nạp Key AI viết bài: </w:t>
-      </w:r>
-      <w:r>
-        <w:t xml:space="preserve">Vào </w:t>
-      </w:r>
-      <w:r>
-        <w:rPr>
-          <w:b/>
-        </w:rPr>
-        <w:t>Tab 6 (Cài đặt AI &amp; Bản quyền)</w:t>
-      </w:r>
-      <w:r>
-        <w:t xml:space="preserve">, dán API Key của bạn (OpenAI, DeepSeek, VyceAI, OmniRoute...) -&gt; Chọn Model muốn dùng -&gt; Bấm </w:t>
-      </w:r>
-      <w:r>
-        <w:rPr>
-          <w:b/>
-        </w:rPr>
-        <w:t>Lưu cấu hình</w:t>
-      </w:r>
-      <w:r>
-        <w:rPr>
-          <w:b/>
-        </w:rPr>
-        <w:t>.</w:t>
-        <w:br/>
-        <w:t xml:space="preserve">2. Nạp Proxy (Nếu có): </w:t>
-      </w:r>
-      <w:r>
-        <w:t xml:space="preserve">Mở file </w:t>
-      </w:r>
-      <w:r>
-        <w:rPr>
-          <w:b/>
-        </w:rPr>
-        <w:t>proxies.txt</w:t>
-      </w:r>
-      <w:r>
-        <w:rPr>
-          <w:b/>
-        </w:rPr>
-        <w:t xml:space="preserve"> ngay ngoài thư mục gốc -&gt; Dán dàn proxy của bạn vào (mỗi dòng 1 proxy) -&gt; Bấm Ctrl + S. (Nếu không có proxy, tool sẽ tự dùng IP máy thật chuẩn 2 luồng an toàn).</w:t>
-        <w:br/>
-        <w:t xml:space="preserve">3. Nạp Cookie Facebook: </w:t>
-      </w:r>
-      <w:r>
-        <w:t xml:space="preserve">Mở file </w:t>
-      </w:r>
-      <w:r>
-        <w:rPr>
-          <w:b/>
-        </w:rPr>
-        <w:t>cookies.txt</w:t>
-      </w:r>
-      <w:r>
-        <w:t xml:space="preserve"> ở thư mục gốc -&gt; Dán chuỗi cookie tài khoản phụ vào để việc cào bài mượt mà nhất.</w:t>
-      </w:r>
-    </w:p>
-    <w:p>
-      <w:pPr>
-        <w:spacing w:before="280" w:after="120"/>
-      </w:pPr>
-      <w:r>
-        <w:rPr>
-          <w:rFonts w:ascii="Calibri" w:hAnsi="Calibri"/>
-          <w:b/>
-          <w:color w:val="1F4E79"/>
-          <w:sz w:val="30"/>
-        </w:rPr>
-        <w:t>BƯỚC 3: CÁCH SỬ DỤNG TOOL HIỆU QUẢ NHẤT (2 PHƯƠNG PHÁP)</w:t>
-      </w:r>
-    </w:p>
-    <w:p>
-      <w:pPr>
-        <w:spacing w:before="280" w:after="120"/>
-      </w:pPr>
-      <w:r>
-        <w:rPr>
-          <w:rFonts w:ascii="Calibri" w:hAnsi="Calibri"/>
-          <w:b/>
-          <w:color w:val="2E75B6"/>
-          <w:sz w:val="25"/>
-        </w:rPr>
-        <w:t>⭐ CÁCH 1: CHẠY FULL TỰ ĐỘNG (KHUYÊN DÙNG — 1 CHẠM LÀ XONG TOÀN BỘ)</w:t>
-      </w:r>
-    </w:p>
-    <w:p>
-      <w:r>
-        <w:t>Đây là chế độ mạnh nhất của phần mềm, chỉ với 1 click duy nhất, hệ thống tự làm sạch từ cào bài -&gt; viết lại AI -&gt; làm ảnh/reel -&gt; đăng web -&gt; xuất file Excel:</w:t>
-        <w:br/>
-      </w:r>
-      <w:r>
-        <w:rPr>
-          <w:b/>
-        </w:rPr>
-        <w:t xml:space="preserve">1. Chọn khu vực: </w:t>
-      </w:r>
-      <w:r>
-        <w:t xml:space="preserve">Ở góc trên cùng, chọn vùng </w:t>
-      </w:r>
-      <w:r>
-        <w:rPr>
-          <w:b/>
-        </w:rPr>
-        <w:t>🇺🇸 US</w:t>
-      </w:r>
-      <w:r>
-        <w:t xml:space="preserve"> (Bóng bầu dục NFL, Bóng rổ, Bóng chày...) hoặc </w:t>
-      </w:r>
-      <w:r>
-        <w:rPr>
-          <w:b/>
-        </w:rPr>
-        <w:t>🌍 GLOBAL</w:t>
-      </w:r>
-      <w:r>
-        <w:t xml:space="preserve"> (Hoàng gia Anh/Bắc Âu, Thể thao Đan Mạch...).</w:t>
-        <w:br/>
-      </w:r>
-      <w:r>
-        <w:rPr>
-          <w:b/>
-        </w:rPr>
-        <w:t xml:space="preserve">2. Bấm nút màu xanh lá to: </w:t>
-      </w:r>
-      <w:r>
-        <w:rPr>
-          <w:b/>
-        </w:rPr>
-        <w:t>⚡ CHẠY FULL TỰ ĐỘNG</w:t>
-      </w:r>
-      <w:r>
-        <w:t xml:space="preserve"> ở góc trên cùng.</w:t>
-        <w:br/>
-      </w:r>
-      <w:r>
-        <w:rPr>
-          <w:b/>
-        </w:rPr>
-        <w:t xml:space="preserve">3. Hộp thoại xác nhận chủ đề hiện ra: </w:t>
-      </w:r>
-      <w:r>
-        <w:t xml:space="preserve">Bạn có thể tích chọn nhanh những chủ đề muốn cào hôm nay (hoặc để mặc định cào tất cả) -&gt; Bấm </w:t>
+        <w:t xml:space="preserve">   - Bấm </w:t>
       </w:r>
       <w:r>
         <w:rPr>
@@ -449,26 +159,349 @@
         <w:t>Bắt đầu</w:t>
       </w:r>
       <w:r>
-        <w:t>.</w:t>
+        <w:t xml:space="preserve"> -&gt; Tool sẽ tự động vận hành toàn bộ quy trình mà bạn không cần phải thao tác thêm bất kỳ nút nào khác!</w:t>
+      </w:r>
+    </w:p>
+    <w:p>
+      <w:pPr>
+        <w:spacing w:before="320" w:after="120"/>
+      </w:pPr>
+      <w:r>
+        <w:rPr>
+          <w:rFonts w:ascii="Segoe UI" w:hAnsi="Segoe UI"/>
+          <w:b/>
+          <w:color w:val="1B365D"/>
+          <w:sz w:val="28"/>
+        </w:rPr>
+        <w:t>2. TAB 2 — KHO BÀI VIẾT (CONTENT POOL)</w:t>
+      </w:r>
+    </w:p>
+    <w:p>
+      <w:r>
+        <w:rPr>
+          <w:rFonts w:ascii="Segoe UI" w:hAnsi="Segoe UI"/>
+        </w:rPr>
+        <w:t>Tab 2 là "nhà kho" lưu trữ toàn bộ các bài viết vừa được cào từ Facebook về. Tại đây bạn có thể kiểm tra chất lượng bài cào và điều phối xử lý.</w:t>
+        <w:br/>
         <w:br/>
       </w:r>
       <w:r>
         <w:rPr>
           <w:b/>
         </w:rPr>
-        <w:t xml:space="preserve">4. Lấy kết quả: </w:t>
+        <w:t>• Các tính năng chính trong Tab 2:</w:t>
+        <w:br/>
       </w:r>
       <w:r>
-        <w:t xml:space="preserve">Sau khi tool chạy xong, bạn mở thư mục </w:t>
+        <w:t xml:space="preserve">   1. </w:t>
       </w:r>
       <w:r>
         <w:rPr>
           <w:b/>
         </w:rPr>
-        <w:t>du_lieu_exel</w:t>
+        <w:t xml:space="preserve">Bộ lọc thông minh: </w:t>
       </w:r>
       <w:r>
-        <w:t xml:space="preserve"> là đã có sẵn file </w:t>
+        <w:t>Lọc bài theo Chủ đề (Key), Nhân vật, Phiên cào hoặc Trạng thái (Chưa xử lý, Đang xử lý, Hoàn thành).</w:t>
+        <w:br/>
+      </w:r>
+      <w:r>
+        <w:t xml:space="preserve">   2. </w:t>
+      </w:r>
+      <w:r>
+        <w:rPr>
+          <w:b/>
+        </w:rPr>
+        <w:t xml:space="preserve">Xem chi tiết bài cào: </w:t>
+      </w:r>
+      <w:r>
+        <w:t>Nhấp vào từng bài để xem nội dung Caption gốc, ảnh gốc và link Facebook nguồn.</w:t>
+        <w:br/>
+      </w:r>
+      <w:r>
+        <w:t xml:space="preserve">   3. </w:t>
+      </w:r>
+      <w:r>
+        <w:rPr>
+          <w:b/>
+        </w:rPr>
+        <w:t xml:space="preserve">Nút "⚡ Xử lý hàng loạt": </w:t>
+      </w:r>
+      <w:r>
+        <w:t>Nếu bạn không chạy Full Tự Động mà cào lẻ từng trang, bạn chỉ cần bấm nút này để đẩy toàn bộ bài chưa xử lý sang cho AI viết tiếp.</w:t>
+        <w:br/>
+      </w:r>
+      <w:r>
+        <w:t xml:space="preserve">   4. </w:t>
+      </w:r>
+      <w:r>
+        <w:rPr>
+          <w:b/>
+        </w:rPr>
+        <w:t xml:space="preserve">Nút "🧹 Dọn Sạch Kho (Reset Lọc Trùng)": </w:t>
+      </w:r>
+      <w:r>
+        <w:t>Khi bạn muốn xóa sạch các bài cũ đã cào để làm mới 100% kho bài từ đầu, bấm nút này để reset hệ thống sạch sẽ.</w:t>
+      </w:r>
+    </w:p>
+    <w:p>
+      <w:pPr>
+        <w:spacing w:before="320" w:after="120"/>
+      </w:pPr>
+      <w:r>
+        <w:rPr>
+          <w:rFonts w:ascii="Segoe UI" w:hAnsi="Segoe UI"/>
+          <w:b/>
+          <w:color w:val="1B365D"/>
+          <w:sz w:val="28"/>
+        </w:rPr>
+        <w:t>3. TAB 3 — AI VIẾT BÀI BÁO &amp; CAPTION VIRAL</w:t>
+      </w:r>
+    </w:p>
+    <w:p>
+      <w:r>
+        <w:rPr>
+          <w:rFonts w:ascii="Segoe UI" w:hAnsi="Segoe UI"/>
+        </w:rPr>
+        <w:t>Tab 3 là "bộ não" AI của hệ thống, sử dụng mô hình trí tuệ nhân tạo chuyên sâu để xào nấu lại nội dung thành phiên bản mới 100% không lo trùng lặp.</w:t>
+        <w:br/>
+        <w:br/>
+      </w:r>
+      <w:r>
+        <w:rPr>
+          <w:b/>
+        </w:rPr>
+        <w:t>• AI sẽ tự động tạo ra 2 phần nội dung cực kỳ quan trọng:</w:t>
+        <w:br/>
+      </w:r>
+      <w:r>
+        <w:t xml:space="preserve">   1. </w:t>
+      </w:r>
+      <w:r>
+        <w:rPr>
+          <w:b/>
+        </w:rPr>
+        <w:t xml:space="preserve">Bài báo vệ tinh dài (1.200 - 1.500 từ): </w:t>
+      </w:r>
+      <w:r>
+        <w:t>Có đầy đủ mở bài, các đề mục (##), phân tích chuyên sâu, giữ chân độc giả đọc lâu để tối ưu doanh thu quảng cáo.</w:t>
+        <w:br/>
+      </w:r>
+      <w:r>
+        <w:t xml:space="preserve">   2. </w:t>
+      </w:r>
+      <w:r>
+        <w:rPr>
+          <w:b/>
+        </w:rPr>
+        <w:t xml:space="preserve">3 Mẫu Caption Facebook Viral: </w:t>
+      </w:r>
+      <w:r>
+        <w:t>Gồm cấu trúc chuẩn kéo click: Câu mở đầu gây tò mò (Hook) -&gt; Thân bài ngắn gọn -&gt; Lời kêu gọi hành động (Call To Action: "Xem chi tiết dưới bình luận...").</w:t>
+        <w:br/>
+        <w:br/>
+      </w:r>
+      <w:r>
+        <w:rPr>
+          <w:b/>
+        </w:rPr>
+        <w:t>• Tính năng Title Prefix (Mã nhận diện người đăng):</w:t>
+        <w:br/>
+      </w:r>
+      <w:r>
+        <w:t xml:space="preserve">   - Tiêu đề bài báo sẽ tự động được gắn mã của bạn (ví dụ: </w:t>
+      </w:r>
+      <w:r>
+        <w:rPr>
+          <w:i/>
+        </w:rPr>
+        <w:t>TH - Tiêu đề bài báo...</w:t>
+      </w:r>
+      <w:r>
+        <w:t>). Tính năng này giúp nhận diện bài viết thuộc về ai, chống việc cào trùng hoặc đăng đè bài của người khác.</w:t>
+      </w:r>
+    </w:p>
+    <w:p>
+      <w:pPr>
+        <w:spacing w:before="320" w:after="120"/>
+      </w:pPr>
+      <w:r>
+        <w:rPr>
+          <w:rFonts w:ascii="Segoe UI" w:hAnsi="Segoe UI"/>
+          <w:b/>
+          <w:color w:val="1B365D"/>
+          <w:sz w:val="28"/>
+        </w:rPr>
+        <w:t>4. TAB 4 — ĐĂNG WEB VỆ TINH &amp; TẠO VIDEO REEL</w:t>
+      </w:r>
+    </w:p>
+    <w:p>
+      <w:r>
+        <w:rPr>
+          <w:rFonts w:ascii="Segoe UI" w:hAnsi="Segoe UI"/>
+        </w:rPr>
+        <w:t>Sau khi AI viết xong bài, hệ thống sẽ tự động chuyển sang Tab 4 để xuất bản lên website và tạo video Reel.</w:t>
+        <w:br/>
+        <w:br/>
+      </w:r>
+      <w:r>
+        <w:rPr>
+          <w:b/>
+        </w:rPr>
+        <w:t>• Tự động đăng Website vệ tinh lấy Link:</w:t>
+        <w:br/>
+      </w:r>
+      <w:r>
+        <w:t xml:space="preserve">   - Tool tự kết nối API và đăng bài báo hoàn chỉnh lên website vệ tinh tương ứng với vùng đã chọn.</w:t>
+        <w:br/>
+        <w:t xml:space="preserve">   - Lấy về đường link bài báo thật (URL) để bạn gắn vào bình luận (comment) trên Facebook kéo traffic về web.</w:t>
+        <w:br/>
+        <w:br/>
+      </w:r>
+      <w:r>
+        <w:rPr>
+          <w:b/>
+        </w:rPr>
+        <w:t>• Tự động xử lý Ảnh chống quét Facebook:</w:t>
+        <w:br/>
+      </w:r>
+      <w:r>
+        <w:t xml:space="preserve">   - Tự động crop viền, chèn khung viền vàng sang trọng và gắn logo watermark để ảnh không bị Facebook quét bản quyền.</w:t>
+        <w:br/>
+        <w:br/>
+      </w:r>
+      <w:r>
+        <w:rPr>
+          <w:b/>
+        </w:rPr>
+        <w:t>• Tự động dựng Video Reel 10 giây có nhạc:</w:t>
+        <w:br/>
+      </w:r>
+      <w:r>
+        <w:t xml:space="preserve">   - Hệ thống tự động ghép ảnh thành video ngắn 10 giây chuẩn tỉ lệ Reel Facebook (9:16).</w:t>
+        <w:br/>
+        <w:t xml:space="preserve">   - Tự động chèn nhạc nền cao trào, cuốn hút từ kho nhạc có sẵn để kích thích người xem tương tác.</w:t>
+      </w:r>
+    </w:p>
+    <w:p>
+      <w:pPr>
+        <w:spacing w:before="320" w:after="120"/>
+      </w:pPr>
+      <w:r>
+        <w:rPr>
+          <w:rFonts w:ascii="Segoe UI" w:hAnsi="Segoe UI"/>
+          <w:b/>
+          <w:color w:val="1B365D"/>
+          <w:sz w:val="28"/>
+        </w:rPr>
+        <w:t>5. TAB 5 — DANH SÁCH BÀI VIẾT HOÀN THÀNH</w:t>
+      </w:r>
+    </w:p>
+    <w:p>
+      <w:r>
+        <w:rPr>
+          <w:rFonts w:ascii="Segoe UI" w:hAnsi="Segoe UI"/>
+        </w:rPr>
+        <w:t>Tab 5 là nơi tập hợp toàn bộ các bài viết đã hoàn thiện 100% mọi khâu (có đủ Caption mới, Link web báo, Ảnh viền và Video Reel).</w:t>
+        <w:br/>
+        <w:br/>
+      </w:r>
+      <w:r>
+        <w:rPr>
+          <w:b/>
+        </w:rPr>
+        <w:t>• Bạn có thể làm gì tại Tab 5:</w:t>
+        <w:br/>
+      </w:r>
+      <w:r>
+        <w:t xml:space="preserve">   - </w:t>
+      </w:r>
+      <w:r>
+        <w:rPr>
+          <w:b/>
+        </w:rPr>
+        <w:t xml:space="preserve">Xem trước trực quan: </w:t>
+      </w:r>
+      <w:r>
+        <w:t>Nhấp vào từng bài để xem trước Caption viral, nhấp vào link để mở bài báo web thật, xem thử video Reel 10s có nhạc.</w:t>
+        <w:br/>
+        <w:t xml:space="preserve">   - </w:t>
+      </w:r>
+      <w:r>
+        <w:rPr>
+          <w:b/>
+        </w:rPr>
+        <w:t xml:space="preserve">Kiểm tra kho bài: </w:t>
+      </w:r>
+      <w:r>
+        <w:t>Hệ thống hiển thị rõ ràng số lượng bài đang có của từng chủ đề để bạn biết chủ đề nào đã đủ bài đăng, chủ đề nào cần cào thêm.</w:t>
+        <w:br/>
+        <w:t xml:space="preserve">   - </w:t>
+      </w:r>
+      <w:r>
+        <w:rPr>
+          <w:b/>
+        </w:rPr>
+        <w:t xml:space="preserve">Làm mới danh sách: </w:t>
+      </w:r>
+      <w:r>
+        <w:t>Bấm nút "Làm mới" bất cứ lúc nào để cập nhật các bài vừa xử lý xong.</w:t>
+      </w:r>
+    </w:p>
+    <w:p>
+      <w:pPr>
+        <w:spacing w:before="320" w:after="120"/>
+      </w:pPr>
+      <w:r>
+        <w:rPr>
+          <w:rFonts w:ascii="Segoe UI" w:hAnsi="Segoe UI"/>
+          <w:b/>
+          <w:color w:val="1B365D"/>
+          <w:sz w:val="28"/>
+        </w:rPr>
+        <w:t>6. XUẤT FILE EXCEL MASTER ĐĂNG BÀI (BẢN SẠCH CỘT - KHÔNG GPM)</w:t>
+      </w:r>
+    </w:p>
+    <w:p>
+      <w:r>
+        <w:rPr>
+          <w:rFonts w:ascii="Segoe UI" w:hAnsi="Segoe UI"/>
+        </w:rPr>
+        <w:t>Đây là bước cuối cùng để lấy toàn bộ dữ liệu bài viết đem đi đăng lên Facebook. Phần mềm đã được tinh chỉnh 100% sạch sẽ dành cho khách hàng không dùng GPM Login.</w:t>
+        <w:br/>
+        <w:br/>
+      </w:r>
+      <w:r>
+        <w:rPr>
+          <w:b/>
+        </w:rPr>
+        <w:t>• Cách xuất file cực kỳ đơn giản:</w:t>
+        <w:br/>
+      </w:r>
+      <w:r>
+        <w:t xml:space="preserve">   1. Trên thanh menu hoặc tại Tab 5, nhấp vào nút: </w:t>
+      </w:r>
+      <w:r>
+        <w:rPr>
+          <w:b/>
+        </w:rPr>
+        <w:t>Xuất MASTER</w:t>
+      </w:r>
+      <w:r>
+        <w:t>.</w:t>
+        <w:br/>
+        <w:t xml:space="preserve">   2. Chọn vùng bạn muốn xuất:</w:t>
+        <w:br/>
+        <w:t xml:space="preserve">      - </w:t>
+      </w:r>
+      <w:r>
+        <w:rPr>
+          <w:b/>
+        </w:rPr>
+        <w:t xml:space="preserve">🇺🇸 Xuất Master US: </w:t>
+      </w:r>
+      <w:r>
+        <w:t xml:space="preserve">Xuất toàn bộ bài viết hoàn thành của vùng US ra file </w:t>
       </w:r>
       <w:r>
         <w:rPr>
@@ -477,21 +510,146 @@
         <w:t>MASTER_DANG_BAI_US.xlsx</w:t>
       </w:r>
       <w:r>
-        <w:t xml:space="preserve"> đầy đủ 100% nội dung để đưa vào GPM Login đăng Facebook!</w:t>
+        <w:t>.</w:t>
+        <w:br/>
+        <w:t xml:space="preserve">      - </w:t>
       </w:r>
-    </w:p>
-    <w:p>
-      <w:pPr>
-        <w:spacing w:before="280" w:after="120"/>
-      </w:pPr>
       <w:r>
         <w:rPr>
-          <w:rFonts w:ascii="Calibri" w:hAnsi="Calibri"/>
           <w:b/>
-          <w:color w:val="2E75B6"/>
-          <w:sz w:val="25"/>
         </w:rPr>
-        <w:t>🛠️ CÁCH 2: CHẠY THỦ CÔNG TỪNG BƯỚC (DÀNH CHO NGƯỜI MUỐN KIỂM SOÁT)</w:t>
+        <w:t xml:space="preserve">🌍 Xuất Master GLOBAL: </w:t>
+      </w:r>
+      <w:r>
+        <w:t xml:space="preserve">Xuất toàn bộ bài viết hoàn thành của vùng Global ra file </w:t>
+      </w:r>
+      <w:r>
+        <w:rPr>
+          <w:b/>
+        </w:rPr>
+        <w:t>MASTER_DANG_BAI_GLOBAL.xlsx</w:t>
+      </w:r>
+      <w:r>
+        <w:t>.</w:t>
+        <w:br/>
+        <w:t xml:space="preserve">   3. File Excel sẽ tự động được tải về máy của bạn và đồng thời lưu trong thư mục </w:t>
+      </w:r>
+      <w:r>
+        <w:rPr>
+          <w:b/>
+        </w:rPr>
+        <w:t>du_lieu_exel/</w:t>
+      </w:r>
+      <w:r>
+        <w:t xml:space="preserve"> của tool.</w:t>
+        <w:br/>
+        <w:br/>
+      </w:r>
+      <w:r>
+        <w:rPr>
+          <w:b/>
+        </w:rPr>
+        <w:t>• Cấu trúc file Excel Master cực kỳ sạch đẹp và dễ dùng:</w:t>
+        <w:br/>
+      </w:r>
+      <w:r>
+        <w:t xml:space="preserve">   -&gt; </w:t>
+      </w:r>
+      <w:r>
+        <w:rPr>
+          <w:b/>
+        </w:rPr>
+        <w:t xml:space="preserve">ĐÃ LOẠI BỎ HOÀN TOÀN: </w:t>
+      </w:r>
+      <w:r>
+        <w:t>Không còn cột PROFILE GPM, không đòi hỏi danh bạ UID rắc rối.</w:t>
+        <w:br/>
+        <w:t xml:space="preserve">   -&gt; </w:t>
+      </w:r>
+      <w:r>
+        <w:rPr>
+          <w:b/>
+        </w:rPr>
+        <w:t>CÁC CỘT NỘI DUNG CHUẨN ĐỂ ĐĂNG BÀI:</w:t>
+        <w:br/>
+      </w:r>
+      <w:r>
+        <w:t xml:space="preserve">      1. </w:t>
+      </w:r>
+      <w:r>
+        <w:rPr>
+          <w:b/>
+        </w:rPr>
+        <w:t xml:space="preserve">STT &amp; Content ID: </w:t>
+      </w:r>
+      <w:r>
+        <w:t>Số thứ tự và mã định danh bài viết.</w:t>
+        <w:br/>
+        <w:t xml:space="preserve">      2. </w:t>
+      </w:r>
+      <w:r>
+        <w:rPr>
+          <w:b/>
+        </w:rPr>
+        <w:t xml:space="preserve">KEY / Chủ đề: </w:t>
+      </w:r>
+      <w:r>
+        <w:t>Tên chủ đề (NFL, WNBA, Vụ án, Hà Lan, Đan Mạch...).</w:t>
+        <w:br/>
+        <w:t xml:space="preserve">      3. </w:t>
+      </w:r>
+      <w:r>
+        <w:rPr>
+          <w:b/>
+        </w:rPr>
+        <w:t xml:space="preserve">Caption mới: </w:t>
+      </w:r>
+      <w:r>
+        <w:t>Nội dung bài đăng Facebook (đã định dạng xuống dòng đẹp mắt, có hook và CTA).</w:t>
+        <w:br/>
+        <w:t xml:space="preserve">      4. </w:t>
+      </w:r>
+      <w:r>
+        <w:rPr>
+          <w:b/>
+        </w:rPr>
+        <w:t xml:space="preserve">Link bài báo: </w:t>
+      </w:r>
+      <w:r>
+        <w:t>Đường link bài báo web vệ tinh dùng để dán vào comment điều hướng traffic.</w:t>
+        <w:br/>
+        <w:t xml:space="preserve">      5. </w:t>
+      </w:r>
+      <w:r>
+        <w:rPr>
+          <w:b/>
+        </w:rPr>
+        <w:t xml:space="preserve">Đường dẫn ảnh: </w:t>
+      </w:r>
+      <w:r>
+        <w:t>Đường dẫn file ảnh gốc đã gắn khung viền vàng trên máy tính.</w:t>
+        <w:br/>
+        <w:t xml:space="preserve">      6. </w:t>
+      </w:r>
+      <w:r>
+        <w:rPr>
+          <w:b/>
+        </w:rPr>
+        <w:t xml:space="preserve">Đường dẫn reel: </w:t>
+      </w:r>
+      <w:r>
+        <w:t xml:space="preserve">Đường dẫn file video Reel 10s có nhạc (nằm trong thư mục </w:t>
+      </w:r>
+      <w:r>
+        <w:rPr>
+          <w:b/>
+        </w:rPr>
+        <w:t>du_lieu_reel/</w:t>
+      </w:r>
+      <w:r>
+        <w:t>) để đăng thước phim.</w:t>
+        <w:br/>
+        <w:br/>
       </w:r>
     </w:p>
     <w:tbl>
@@ -501,181 +659,30 @@
         <w:tblLook w:firstColumn="1" w:firstRow="1" w:lastColumn="0" w:lastRow="0" w:noHBand="0" w:noVBand="1" w:val="04A0"/>
       </w:tblPr>
       <w:tblGrid>
-        <w:gridCol w:w="4968"/>
-        <w:gridCol w:w="4968"/>
+        <w:gridCol w:w="9936"/>
       </w:tblGrid>
       <w:tr>
         <w:tc>
           <w:tcPr>
-            <w:tcW w:type="dxa" w:w="2592"/>
-            <w:shd w:fill="1F4E79"/>
+            <w:tcW w:type="dxa" w:w="9792"/>
+            <w:shd w:fill="F0F4F8"/>
           </w:tcPr>
           <w:p>
+            <w:pPr>
+              <w:spacing w:before="120" w:after="120"/>
+              <w:ind w:left="144" w:right="144"/>
+            </w:pPr>
             <w:r>
               <w:rPr>
-                <w:rFonts w:ascii="Calibri" w:hAnsi="Calibri"/>
-                <w:b/>
-                <w:color w:val="FFFFFF"/>
+                <w:rFonts w:ascii="Segoe UI" w:hAnsi="Segoe UI"/>
+                <w:color w:val="1E293B"/>
+                <w:sz w:val="20"/>
               </w:rPr>
-              <w:t>Tab Chức Năng</w:t>
-            </w:r>
-          </w:p>
-        </w:tc>
-        <w:tc>
-          <w:tcPr>
-            <w:tcW w:type="dxa" w:w="7200"/>
-            <w:shd w:fill="1F4E79"/>
-          </w:tcPr>
-          <w:p>
-            <w:r>
-              <w:rPr>
-                <w:rFonts w:ascii="Calibri" w:hAnsi="Calibri"/>
-                <w:b/>
-                <w:color w:val="FFFFFF"/>
-              </w:rPr>
-              <w:t>Thao Tác Thực Hiện Cực Dễ</w:t>
-            </w:r>
-          </w:p>
-        </w:tc>
-      </w:tr>
-      <w:tr>
-        <w:tc>
-          <w:tcPr>
-            <w:tcW w:type="dxa" w:w="2592"/>
-            <w:shd w:fill="F2F4F7"/>
-          </w:tcPr>
-          <w:p>
-            <w:r>
-              <w:rPr>
-                <w:rFonts w:ascii="Calibri" w:hAnsi="Calibri"/>
-                <w:b/>
-                <w:color w:val="1F4E79"/>
-              </w:rPr>
-              <w:t>Tab 1: Cào Bài</w:t>
-            </w:r>
-          </w:p>
-        </w:tc>
-        <w:tc>
-          <w:tcPr>
-            <w:tcW w:type="dxa" w:w="7200"/>
-            <w:shd w:fill="F2F4F7"/>
-          </w:tcPr>
-          <w:p>
-            <w:r>
-              <w:rPr>
-                <w:rFonts w:ascii="Calibri" w:hAnsi="Calibri"/>
-                <w:sz w:val="19"/>
-              </w:rPr>
-              <w:t>• Chọn tích các chủ đề trong kho nguồn (hơn 200 nguồn VIP có sẵn) HOẶC dán link fanpage bất kỳ vào ô nhập.</w:t>
+              <w:t>🎯 CÁCH SỬ DỤNG FILE ĐĂNG BÀI:</w:t>
               <w:br/>
-              <w:t>• Bấm [Bắt đầu cào bài]. Sau khi cào xong, bài sẽ tự nạp vào Kho bài.</w:t>
-            </w:r>
-          </w:p>
-        </w:tc>
-      </w:tr>
-      <w:tr>
-        <w:tc>
-          <w:tcPr>
-            <w:tcW w:type="dxa" w:w="2592"/>
-            <w:shd w:fill="FFFFFF"/>
-          </w:tcPr>
-          <w:p>
-            <w:r>
-              <w:rPr>
-                <w:rFonts w:ascii="Calibri" w:hAnsi="Calibri"/>
-                <w:b/>
-                <w:color w:val="1F4E79"/>
-              </w:rPr>
-              <w:t>Tab 2: Xử Lý Hàng Loạt</w:t>
-            </w:r>
-          </w:p>
-        </w:tc>
-        <w:tc>
-          <w:tcPr>
-            <w:tcW w:type="dxa" w:w="7200"/>
-            <w:shd w:fill="FFFFFF"/>
-          </w:tcPr>
-          <w:p>
-            <w:r>
-              <w:rPr>
-                <w:rFonts w:ascii="Calibri" w:hAnsi="Calibri"/>
-                <w:sz w:val="19"/>
-              </w:rPr>
-              <w:t>• Tích chọn các bài muốn làm.</w:t>
+              <w:t>• Đăng bằng tay: Mở file Excel lên, copy Caption mới dán vào Facebook, lấy file ảnh hoặc video trong thư mục du_lieu_reel để tải lên, sau đó dán Link bài báo vào bình luận đầu tiên.</w:t>
               <w:br/>
-              <w:t>• Bấm [Viết lại AI]: Tự sinh 3 caption viral + bài báo tiếng Anh chuẩn SEO.</w:t>
-              <w:br/>
-              <w:t>• Bấm [Tải ảnh &amp; Watermark]: Tự gắn viền vàng + logo chống trùng.</w:t>
-              <w:br/>
-              <w:t>• Bấm [Tạo Video Reel]: Tự ráp video ngắn 10s có nhạc bản quyền.</w:t>
-            </w:r>
-          </w:p>
-        </w:tc>
-      </w:tr>
-      <w:tr>
-        <w:tc>
-          <w:tcPr>
-            <w:tcW w:type="dxa" w:w="2592"/>
-            <w:shd w:fill="F2F4F7"/>
-          </w:tcPr>
-          <w:p>
-            <w:r>
-              <w:rPr>
-                <w:rFonts w:ascii="Calibri" w:hAnsi="Calibri"/>
-                <w:b/>
-                <w:color w:val="1F4E79"/>
-              </w:rPr>
-              <w:t>Tab 3: Đăng Web Báo</w:t>
-            </w:r>
-          </w:p>
-        </w:tc>
-        <w:tc>
-          <w:tcPr>
-            <w:tcW w:type="dxa" w:w="7200"/>
-            <w:shd w:fill="F2F4F7"/>
-          </w:tcPr>
-          <w:p>
-            <w:r>
-              <w:rPr>
-                <w:rFonts w:ascii="Calibri" w:hAnsi="Calibri"/>
-                <w:sz w:val="19"/>
-              </w:rPr>
-              <w:t>• Bấm [Đăng lên Website]: Bài viết sẽ tự xuất bản lên website vệ tinh và trả về link bài báo chính thức (có gắn mã nhận diện TH của bạn).</w:t>
-            </w:r>
-          </w:p>
-        </w:tc>
-      </w:tr>
-      <w:tr>
-        <w:tc>
-          <w:tcPr>
-            <w:tcW w:type="dxa" w:w="2592"/>
-            <w:shd w:fill="FFFFFF"/>
-          </w:tcPr>
-          <w:p>
-            <w:r>
-              <w:rPr>
-                <w:rFonts w:ascii="Calibri" w:hAnsi="Calibri"/>
-                <w:b/>
-                <w:color w:val="1F4E79"/>
-              </w:rPr>
-              <w:t>Tab 5: Xuất Master Excel</w:t>
-            </w:r>
-          </w:p>
-        </w:tc>
-        <w:tc>
-          <w:tcPr>
-            <w:tcW w:type="dxa" w:w="7200"/>
-            <w:shd w:fill="FFFFFF"/>
-          </w:tcPr>
-          <w:p>
-            <w:r>
-              <w:rPr>
-                <w:rFonts w:ascii="Calibri" w:hAnsi="Calibri"/>
-                <w:sz w:val="19"/>
-              </w:rPr>
-              <w:t>• Bấm [Xuất Master (US)] hoặc [Xuất Master (GLOBAL)].</w:t>
-              <w:br/>
-              <w:t>• Tool tự điền Caption, Link báo, Link Ảnh, Link Reel vào file Excel thành phẩm.</w:t>
+              <w:t>• Đăng bằng phần mềm auto khác: Nạp trực tiếp file Excel này vào bất kỳ tool nuôi nick/auto post nào bạn đang dùng để đăng hàng loạt cực nhanh!</w:t>
             </w:r>
           </w:p>
         </w:tc>
@@ -683,128 +690,48 @@
     </w:tbl>
     <w:p>
       <w:pPr>
-        <w:spacing w:before="280" w:after="120"/>
+        <w:spacing w:after="40"/>
+      </w:pPr>
+    </w:p>
+    <w:p>
+      <w:pPr>
+        <w:spacing w:before="320" w:after="120"/>
       </w:pPr>
       <w:r>
         <w:rPr>
-          <w:rFonts w:ascii="Calibri" w:hAnsi="Calibri"/>
+          <w:rFonts w:ascii="Segoe UI" w:hAnsi="Segoe UI"/>
           <w:b/>
-          <w:color w:val="1F4E79"/>
-          <w:sz w:val="30"/>
+          <w:color w:val="1B365D"/>
+          <w:sz w:val="28"/>
         </w:rPr>
-        <w:t>BƯỚC 4: TÍNH NĂNG ĐẶC BIỆT — BẮT BÀI NỔ &amp; GẮN CMT (TAB 6)</w:t>
+        <w:t>7. MỘT SỐ LƯU Ý QUAN TRỌNG KHI SỬ DỤNG</w:t>
       </w:r>
     </w:p>
     <w:p>
       <w:r>
-        <w:t xml:space="preserve">• </w:t>
+        <w:t xml:space="preserve">1. </w:t>
       </w:r>
       <w:r>
         <w:rPr>
           <w:b/>
         </w:rPr>
-        <w:t xml:space="preserve">Tự động giám sát bài Viral 24/7: </w:t>
+        <w:t xml:space="preserve">Giữ cửa sổ đen (terminal) luôn chạy: </w:t>
       </w:r>
       <w:r>
-        <w:t>Tool tự quét các video Reel và bài đăng trên các Page của bạn. Khi có bài đạt mốc nổ view (20K, 50K, 100K view), tool sẽ phát chuông cảnh báo và gửi thông báo Telegram.</w:t>
+        <w:t>Trong suốt quá trình tool làm việc, cửa sổ đen phải luôn mở dưới Taskbar. Nếu tắt cửa sổ đen thì WebUI cũng sẽ dừng lại.</w:t>
         <w:br/>
-        <w:t xml:space="preserve">• </w:t>
+      </w:r>
+      <w:r>
+        <w:t xml:space="preserve">2. </w:t>
       </w:r>
       <w:r>
         <w:rPr>
           <w:b/>
         </w:rPr>
-        <w:t xml:space="preserve">Nút [Đánh dấu OK] thông minh: </w:t>
+        <w:t xml:space="preserve">Cập nhật Proxy khi hết hạn: </w:t>
       </w:r>
       <w:r>
-        <w:t xml:space="preserve">Khi có bài nổ, bạn vào Facebook dán link báo vào phần comment để kéo traffic. Sau khi gắn xong, bạn bấm nút </w:t>
-      </w:r>
-      <w:r>
-        <w:rPr>
-          <w:b/>
-        </w:rPr>
-        <w:t>[Đánh dấu OK]</w:t>
-      </w:r>
-      <w:r>
-        <w:t xml:space="preserve"> trên WebUI -&gt; Hàng sẽ chuyển sang màu xanh lá và tool sẽ </w:t>
-      </w:r>
-      <w:r>
-        <w:rPr>
-          <w:b/>
-        </w:rPr>
-        <w:t>tuyệt đối không báo lại bài đó nữa</w:t>
-      </w:r>
-      <w:r>
-        <w:t xml:space="preserve"> để tránh làm phiền bạn.</w:t>
-      </w:r>
-    </w:p>
-    <w:p>
-      <w:pPr>
-        <w:spacing w:before="280" w:after="120"/>
-      </w:pPr>
-      <w:r>
-        <w:rPr>
-          <w:rFonts w:ascii="Calibri" w:hAnsi="Calibri"/>
-          <w:b/>
-          <w:color w:val="C00000"/>
-          <w:sz w:val="30"/>
-        </w:rPr>
-        <w:t>⚠️ 4 NGUYÊN TẮC VÀNG CẦN NHỚ</w:t>
-      </w:r>
-    </w:p>
-    <w:p>
-      <w:r>
-        <w:rPr>
-          <w:b/>
-        </w:rPr>
-        <w:t xml:space="preserve">1. </w:t>
-      </w:r>
-      <w:r>
-        <w:t xml:space="preserve">Thư mục </w:t>
-      </w:r>
-      <w:r>
-        <w:rPr>
-          <w:b/>
-        </w:rPr>
-        <w:t>du_lieu_exel</w:t>
-      </w:r>
-      <w:r>
-        <w:t>: Là nơi chứa file Excel cuối cùng để nạp vào tool đăng bài GPM Login.</w:t>
-        <w:br/>
-      </w:r>
-      <w:r>
-        <w:rPr>
-          <w:b/>
-        </w:rPr>
-        <w:t xml:space="preserve">2. </w:t>
-      </w:r>
-      <w:r>
-        <w:t xml:space="preserve">Thư mục </w:t>
-      </w:r>
-      <w:r>
-        <w:rPr>
-          <w:b/>
-        </w:rPr>
-        <w:t>core/</w:t>
-      </w:r>
-      <w:r>
-        <w:t>: Chứa toàn bộ mã nguồn hệ thống bảo mật, tuyệt đối không chỉnh sửa hoặc xóa.</w:t>
-        <w:br/>
-      </w:r>
-      <w:r>
-        <w:rPr>
-          <w:b/>
-        </w:rPr>
-        <w:t xml:space="preserve">3. </w:t>
-      </w:r>
-      <w:r>
-        <w:rPr>
-          <w:b/>
-        </w:rPr>
-        <w:t xml:space="preserve">Khi proxy hết hạn: </w:t>
-      </w:r>
-      <w:r>
-        <w:t xml:space="preserve">Chỉ cần mở file </w:t>
+        <w:t xml:space="preserve">Khi proxy hết hạn, bạn chỉ cần mở file </w:t>
       </w:r>
       <w:r>
         <w:rPr>
@@ -813,23 +740,20 @@
         <w:t>proxies.txt</w:t>
       </w:r>
       <w:r>
-        <w:t xml:space="preserve"> ở thư mục gốc, dán proxy mới vào rồi lưu lại là tool nhận ngay.</w:t>
+        <w:t xml:space="preserve"> ở thư mục gốc, xóa proxy cũ và dán danh sách proxy mới vào rồi lưu lại là xong ngay.</w:t>
         <w:br/>
+      </w:r>
+      <w:r>
+        <w:t xml:space="preserve">3. </w:t>
       </w:r>
       <w:r>
         <w:rPr>
           <w:b/>
         </w:rPr>
-        <w:t xml:space="preserve">4. </w:t>
+        <w:t xml:space="preserve">Đóng file Excel trước khi xuất mới: </w:t>
       </w:r>
       <w:r>
-        <w:rPr>
-          <w:b/>
-        </w:rPr>
-        <w:t xml:space="preserve">Hỗ trợ kỹ thuật: </w:t>
-      </w:r>
-      <w:r>
-        <w:t>Nếu cần cấp thêm License Key cho máy khác hoặc đổi máy, liên hệ Admin để được cấp key mới ngay lập tức.</w:t>
+        <w:t>Nếu bạn đang mở file MASTER_DANG_BAI_US.xlsx bằng Microsoft Excel, hãy đóng file lại trước khi bấm nút Xuất Master trên web để tool có thể ghi đè dữ liệu mới.</w:t>
       </w:r>
     </w:p>
     <w:sectPr>

</xml_diff>